<commit_message>
Add lesson 2 introduction script
</commit_message>
<xml_diff>
--- a/lesson2/Урок 2.docx
+++ b/lesson2/Урок 2.docx
@@ -60,6 +60,165 @@
         </w:rPr>
         <w:t xml:space="preserve"> готовый портал, броню и оружие с модификациями</w:t>
       </w:r>
+    </w:p>
+    <w:p>
+      <w:pPr>
+        <w:pStyle w:val="1"/>
+      </w:pPr>
+      <w:r>
+        <w:t>Вступление ко второму уроку</w:t>
+      </w:r>
+    </w:p>
+    <w:p>
+      <w:r>
+        <w:t>Добрый день, ребята!</w:t>
+      </w:r>
+    </w:p>
+    <w:p>
+      <w:r>
+        <w:t>На прошлом занятии мы подготовили все необходимые элементы для нашего проекта: создали блок для рамки портала, предмет для его активации и разработали текстуры, которые будут использоваться в дальнейшем.</w:t>
+      </w:r>
+    </w:p>
+    <w:p>
+      <w:r>
+        <w:t>Сегодня мы переходим к самому интересному этапу — созданию собственного портала.</w:t>
+      </w:r>
+    </w:p>
+    <w:p>
+      <w:r>
+        <w:t>На этом уроке вам предстоит собрать все подготовленные элементы вместе и превратить их в полноценственную игровую механику. Мы будем создавать портал, настраивать его свойства и определять, как именно он будет работать в игре.</w:t>
+      </w:r>
+    </w:p>
+    <w:p>
+      <w:r>
+        <w:t>Подумайте, что делает ваш портал особенным. Возможно, он переносит игрока в другое измерение, открывает проход в секретную локацию или служит входом в загадочный мир. Сегодня у вас будет возможность настроить его так, как вы сами задумали.</w:t>
+      </w:r>
+    </w:p>
+    <w:p>
+      <w:pPr>
+        <w:pStyle w:val="1"/>
+      </w:pPr>
+      <w:r>
+        <w:t>План работы на уроке</w:t>
+      </w:r>
+    </w:p>
+    <w:p>
+      <w:r>
+        <w:t>Сегодня мы:</w:t>
+      </w:r>
+    </w:p>
+    <w:p>
+      <w:pPr>
+        <w:pStyle w:val="a7"/>
+      </w:pPr>
+      <w:r>
+        <w:t>1. Создадим собственный портал в MCreator.</w:t>
+      </w:r>
+    </w:p>
+    <w:p>
+      <w:pPr>
+        <w:pStyle w:val="a7"/>
+      </w:pPr>
+      <w:r>
+        <w:t>2. Настроим его внешний вид.</w:t>
+      </w:r>
+    </w:p>
+    <w:p>
+      <w:pPr>
+        <w:pStyle w:val="a7"/>
+      </w:pPr>
+      <w:r>
+        <w:t>3. Настроим его основные параметры и поведение.</w:t>
+      </w:r>
+    </w:p>
+    <w:p>
+      <w:pPr>
+        <w:pStyle w:val="a7"/>
+      </w:pPr>
+      <w:r>
+        <w:t>4. Проверим работу портала в игре.</w:t>
+      </w:r>
+    </w:p>
+    <w:p>
+      <w:pPr>
+        <w:pStyle w:val="a7"/>
+      </w:pPr>
+      <w:r>
+        <w:t>5. При необходимости исправим ошибки и доработаем настройки.</w:t>
+      </w:r>
+    </w:p>
+    <w:p>
+      <w:r>
+        <w:t>После того как портал будет готов и протестирован, мы перейдём к дополнительной творческой части проекта.</w:t>
+      </w:r>
+    </w:p>
+    <w:p>
+      <w:r>
+        <w:t>Как и в прошлом модуле, вы сможете создать собственный комплект брони. Однако сегодня мы немного изменим подход к работе с текстурами.</w:t>
+      </w:r>
+    </w:p>
+    <w:p>
+      <w:r>
+        <w:t>Вместо того чтобы рисовать текстуры с нуля, вы сможете выбрать понравившиеся варианты из сообщества готовых текстур. Это позволит вам сосредоточиться на создании интересного дизайна и быстрее добавить броню в свой проект.</w:t>
+      </w:r>
+    </w:p>
+    <w:p>
+      <w:r>
+        <w:t>При выборе текстур старайтесь подбирать такие варианты, которые подходят к тематике вашего портала. Например, если портал связан с магией, можно выбрать мистические текстуры. Если портал ведёт в технологичный мир — подобрать более футуристичный стиль.</w:t>
+      </w:r>
+    </w:p>
+    <w:p>
+      <w:pPr>
+        <w:pStyle w:val="1"/>
+      </w:pPr>
+      <w:r>
+        <w:t>Итог урока</w:t>
+      </w:r>
+    </w:p>
+    <w:p>
+      <w:r>
+        <w:t>К концу занятия у вас должен получиться:</w:t>
+      </w:r>
+    </w:p>
+    <w:p>
+      <w:pPr>
+        <w:pStyle w:val="a7"/>
+      </w:pPr>
+      <w:r>
+        <w:t>• полностью работающий портал;</w:t>
+      </w:r>
+    </w:p>
+    <w:p>
+      <w:pPr>
+        <w:pStyle w:val="a7"/>
+      </w:pPr>
+      <w:r>
+        <w:t>• настроенная механика его активации;</w:t>
+      </w:r>
+    </w:p>
+    <w:p>
+      <w:pPr>
+        <w:pStyle w:val="a7"/>
+      </w:pPr>
+      <w:r>
+        <w:t>• протестированная работа в игре;</w:t>
+      </w:r>
+    </w:p>
+    <w:p>
+      <w:pPr>
+        <w:pStyle w:val="a7"/>
+      </w:pPr>
+      <w:r>
+        <w:t>• собственный комплект брони с выбранными текстурами (если успеем перейти к дополнительной части).</w:t>
+      </w:r>
+    </w:p>
+    <w:p>
+      <w:r>
+        <w:t>Сегодняшний урок — это момент, когда ваши идеи начинают превращаться в полноценственную модификацию. Поэтому внимательно работаем с настройками, тестируем результаты и стараемся сделать проект максимально интересным и уникальным.</w:t>
+      </w:r>
+    </w:p>
+    <w:p>
+      <w:r/>
     </w:p>
     <w:p>
       <w:pPr>

</xml_diff>